<commit_message>
Apply Chris Carr's round-3 decisions
Cut the 4-Day Advanced Ski Seminar and OAT x SMG Backpacking. Keep the
3-Day Expedition Style climb at $1,595 and drop the 2027 price line.
Use Chris's rewritten Casaval Ridge copy. Put the route map on the
"Which route is right for you?" card. Credit and link Dane Brinkley
and Casaval Personal Training on the training download. Record
info@shastaguides.com as the lead notification address in the sheet.

Co-Authored-By: Claude Fable 5.1 <noreply@anthropic.com>
</commit_message>
<xml_diff>
--- a/Shasta Mountain Guides – Website Content Sheet (Round 3).docx
+++ b/Shasta Mountain Guides – Website Content Sheet (Round 3).docx
@@ -43,7 +43,7 @@
           <w:sz w:val="20"/>
           <w:szCs w:val="20"/>
         </w:rPr>
-        <w:t xml:space="preserve">Homepage · prepared by The Clay Media · October 13, 2026</w:t>
+        <w:t xml:space="preserve">Homepage + program pages · prepared by The Clay Media · revised October 14, 2026 with Chris’s Round 3 notes applied</w:t>
       </w:r>
     </w:p>
     <w:p>
@@ -6135,7 +6135,7 @@
                 <w:sz w:val="20"/>
                 <w:szCs w:val="20"/>
               </w:rPr>
-              <w:t xml:space="preserve">Please send a photo.</w:t>
+              <w:t xml:space="preserve">Chris: photo not found. Initials stay until one arrives.</w:t>
             </w:r>
           </w:p>
         </w:tc>
@@ -6623,7 +6623,7 @@
                 <w:sz w:val="20"/>
                 <w:szCs w:val="20"/>
               </w:rPr>
-              <w:t xml:space="preserve">Please send a photo.</w:t>
+              <w:t xml:space="preserve">Chris: photo not found. Initials stay until one arrives.</w:t>
             </w:r>
           </w:p>
         </w:tc>
@@ -6745,7 +6745,7 @@
                 <w:sz w:val="20"/>
                 <w:szCs w:val="20"/>
               </w:rPr>
-              <w:t xml:space="preserve">Please send a photo, role, certifications and a short bio.</w:t>
+              <w:t xml:space="preserve">Chris: photo not found, needs more information. Confirm whether to keep her on the homepage.</w:t>
             </w:r>
           </w:p>
         </w:tc>
@@ -6772,7 +6772,7 @@
           <w:sz w:val="19"/>
           <w:szCs w:val="19"/>
         </w:rPr>
-        <w:t xml:space="preserve">Three guides still need photos (John Michael, Lael, Rachel) and Rachel needs a bio. Square photos, at least 800 px. If you send a full current roster we will also refresh the team page.</w:t>
+        <w:t xml:space="preserve">Still open: photos for John Michael and Lael, and a decision plus photo and bio for Rachel. Square photos, at least 800 px.</w:t>
       </w:r>
     </w:p>
     <w:p>
@@ -8478,7 +8478,7 @@
                 <w:sz w:val="20"/>
                 <w:szCs w:val="20"/>
               </w:rPr>
-              <w:t xml:space="preserve">Links to /articles/choosingaroute · Photo: “West Face Shastina”</w:t>
+              <w:t xml:space="preserve">Links to /articles/choosingaroute · Photo: your Mt. Shasta route map</w:t>
             </w:r>
           </w:p>
         </w:tc>
@@ -8509,7 +8509,7 @@
                 <w:sz w:val="20"/>
                 <w:szCs w:val="20"/>
               </w:rPr>
-              <w:t xml:space="preserve">The new route map in the Drive folder would suit this card well. Say the word.</w:t>
+              <w:t xml:space="preserve">Done — route map added per your note.</w:t>
             </w:r>
           </w:p>
         </w:tc>
@@ -9545,7 +9545,7 @@
                 <w:sz w:val="20"/>
                 <w:szCs w:val="20"/>
               </w:rPr>
-              <w:t xml:space="preserve">Our guide to getting fit for the mountain, plus a week-by-week training plan written by senior guide Dane Brinkley. Built for people with jobs and no mountain out the back door.</w:t>
+              <w:t xml:space="preserve">Our guide to getting fit for the mountain, plus a week-by-week training plan by senior guide Dane Brinkley of Casaval Personal Training. Built for people with jobs and no mountain out the back door.</w:t>
             </w:r>
           </w:p>
           <w:p>
@@ -9571,7 +9571,7 @@
                 <w:sz w:val="20"/>
                 <w:szCs w:val="20"/>
               </w:rPr>
-              <w:t xml:space="preserve">Delivers: “Training for Mount Shasta” (24 pp, compressed to 3.8 MB) and the Casaval training plan (15 pp)</w:t>
+              <w:t xml:space="preserve">Delivers: “Training for Mount Shasta” (24 pp) and Dane’s plan (15 pp). The thank-you links to Casaval Personal Training for coaching.</w:t>
             </w:r>
           </w:p>
         </w:tc>
@@ -9602,7 +9602,7 @@
                 <w:sz w:val="20"/>
                 <w:szCs w:val="20"/>
               </w:rPr>
-              <w:t xml:space="preserve">Done — both files from the Drive folder. Confirm you are happy crediting Dane and Casaval Personal Training.</w:t>
+              <w:t xml:space="preserve">Done — Dane and Casaval PT credited and linked, per your note.</w:t>
             </w:r>
           </w:p>
         </w:tc>
@@ -10072,26 +10072,18 @@
     </w:tbl>
     <w:p>
       <w:pPr>
-        <w:spacing w:after="140" w:before="100"/>
+        <w:spacing w:after="120"/>
       </w:pPr>
       <w:r>
         <w:rPr>
           <w:rFonts w:ascii="Calibri" w:cs="Calibri" w:eastAsia="Calibri" w:hAnsi="Calibri"/>
-          <w:b/>
-          <w:bCs/>
-          <w:color w:val="B7791F"/>
-          <w:sz w:val="19"/>
-          <w:szCs w:val="19"/>
+          <w:i/>
+          <w:iCs/>
+          <w:color w:val="54697A"/>
+          <w:sz w:val="18"/>
+          <w:szCs w:val="18"/>
         </w:rPr>
-        <w:t xml:space="preserve">PLACEHOLDER — </w:t>
-      </w:r>
-      <w:r>
-        <w:rPr>
-          <w:rFonts w:ascii="Calibri" w:cs="Calibri" w:eastAsia="Calibri" w:hAnsi="Calibri"/>
-          <w:sz w:val="19"/>
-          <w:szCs w:val="19"/>
-        </w:rPr>
-        <w:t xml:space="preserve">We still need the email address (or CRM) where lead notifications should go.</w:t>
+        <w:t xml:space="preserve">Lead notifications for all forms go to info@shastaguides.com, per your note.</w:t>
       </w:r>
     </w:p>
     <w:p>
@@ -12332,26 +12324,18 @@
     </w:tbl>
     <w:p>
       <w:pPr>
-        <w:spacing w:after="140" w:before="100"/>
+        <w:spacing w:after="120"/>
       </w:pPr>
       <w:r>
         <w:rPr>
           <w:rFonts w:ascii="Calibri" w:cs="Calibri" w:eastAsia="Calibri" w:hAnsi="Calibri"/>
-          <w:b/>
-          <w:bCs/>
-          <w:color w:val="B7791F"/>
-          <w:sz w:val="19"/>
-          <w:szCs w:val="19"/>
+          <w:i/>
+          <w:iCs/>
+          <w:color w:val="54697A"/>
+          <w:sz w:val="18"/>
+          <w:szCs w:val="18"/>
         </w:rPr>
-        <w:t xml:space="preserve">PLACEHOLDER — </w:t>
-      </w:r>
-      <w:r>
-        <w:rPr>
-          <w:rFonts w:ascii="Calibri" w:cs="Calibri" w:eastAsia="Calibri" w:hAnsi="Calibri"/>
-          <w:sz w:val="19"/>
-          <w:szCs w:val="19"/>
-        </w:rPr>
-        <w:t xml:space="preserve">Where should form submissions go? An email inbox, a CRM, or both? We can also add SMS or Slack notifications.</w:t>
+        <w:t xml:space="preserve">Submissions go to info@shastaguides.com, per your note. SMS or Slack notifications can be added later.</w:t>
       </w:r>
     </w:p>
     <w:p>
@@ -13132,7 +13116,7 @@
           <w:sz w:val="20"/>
           <w:szCs w:val="20"/>
         </w:rPr>
-        <w:t xml:space="preserve">Articles — West Face Shastina, crampons climbing, view from camp, crampons on, rachel leading shasta</w:t>
+        <w:t xml:space="preserve">Articles — shastaroutemap, crampons climbing, view from camp, crampons on, rachel leading shasta</w:t>
       </w:r>
     </w:p>
     <w:p>
@@ -13250,7 +13234,7 @@
           <w:sz w:val="20"/>
           <w:szCs w:val="20"/>
         </w:rPr>
-        <w:t xml:space="preserve">Copy, prices and dates were taken from your current website in October 2026. For each trip, use the notes column to write KEEP, CUT, or the new 2027 price. Anything you leave blank we will keep as shown.</w:t>
+        <w:t xml:space="preserve">Copy, prices and dates were taken from your current website in October 2026. Your Round 3 notes are applied: the 4-Day Advanced Ski Seminar and OAT x SMG Backpacking are cut, the 3-Day Expedition Style climb stays at $1,595, and the Casaval Ridge text is yours. For anything else, write KEEP, CUT, or the new 2027 price in the notes column. Blank means keep.</w:t>
       </w:r>
     </w:p>
     <w:p>
@@ -14449,7 +14433,7 @@
                 <w:sz w:val="20"/>
                 <w:szCs w:val="20"/>
               </w:rPr>
-              <w:t xml:space="preserve">Length: 3 days  ·  Route: Avalanche Gulch, with the West Face or Clear Creek as alternates  ·  Cost: $1,595 per person · $1,695 for 2027</w:t>
+              <w:t xml:space="preserve">Length: 3 days  ·  Route: Avalanche Gulch, with the West Face or Clear Creek as alternates  ·  Cost: $1,595 per person</w:t>
             </w:r>
           </w:p>
           <w:p>
@@ -15002,7 +14986,7 @@
                 <w:sz w:val="20"/>
                 <w:szCs w:val="20"/>
               </w:rPr>
-              <w:t xml:space="preserve">Shasta's most aesthetic line: exposed ridge climbing on snow and rock that rewards fit, experienced mountaineers. Prime in April and May.</w:t>
+              <w:t xml:space="preserve">Shasta's most aesthetic line: exposed ridge climbing on steep snow that rewards fit, experienced mountaineers. Prime in April and May.</w:t>
             </w:r>
           </w:p>
           <w:p>
@@ -15028,7 +15012,7 @@
                 <w:sz w:val="20"/>
                 <w:szCs w:val="20"/>
               </w:rPr>
-              <w:t xml:space="preserve">Physical demand: Must be in good physical condition and training diligently for the challenge.</w:t>
+              <w:t xml:space="preserve">Physical demand: Must be in prime physical condition and training diligently for the challenge. This is Shasta's longest, most demanding route.</w:t>
             </w:r>
           </w:p>
         </w:tc>
@@ -17081,7 +17065,7 @@
           <w:sz w:val="18"/>
           <w:szCs w:val="18"/>
         </w:rPr>
-        <w:t xml:space="preserve">9 trip cards on this page, in order. Write KEEP, CUT or the 2027 price in the notes column.</w:t>
+        <w:t xml:space="preserve">8 trip cards on this page, in order. Write KEEP, CUT or the 2027 price in the notes column.</w:t>
       </w:r>
     </w:p>
     <w:tbl>
@@ -18183,142 +18167,7 @@
                 <w:sz w:val="19"/>
                 <w:szCs w:val="19"/>
               </w:rPr>
-              <w:t xml:space="preserve">8. 4-Day Advanced Ski Seminar  (Advanced)</w:t>
-            </w:r>
-          </w:p>
-        </w:tc>
-        <w:tc>
-          <w:tcPr>
-            <w:tcW w:type="dxa" w:w="4560"/>
-            <w:tcBorders>
-              <w:top w:val="single" w:color="DCE7EF" w:sz="4"/>
-              <w:left w:val="single" w:color="DCE7EF" w:sz="4"/>
-              <w:bottom w:val="single" w:color="DCE7EF" w:sz="4"/>
-              <w:right w:val="single" w:color="DCE7EF" w:sz="4"/>
-            </w:tcBorders>
-            <w:tcMar>
-              <w:top w:type="dxa" w:w="80"/>
-              <w:left w:type="dxa" w:w="110"/>
-              <w:bottom w:type="dxa" w:w="80"/>
-              <w:right w:type="dxa" w:w="110"/>
-            </w:tcMar>
-          </w:tcPr>
-          <w:p>
-            <w:pPr>
-              <w:spacing w:after="60"/>
-            </w:pPr>
-            <w:r>
-              <w:rPr>
-                <w:rFonts w:ascii="Calibri" w:cs="Calibri" w:eastAsia="Calibri" w:hAnsi="Calibri"/>
-                <w:sz w:val="20"/>
-                <w:szCs w:val="20"/>
-              </w:rPr>
-              <w:t xml:space="preserve">Length: 4 days  ·  Cost: $1,795 per person</w:t>
-            </w:r>
-          </w:p>
-          <w:p>
-            <w:pPr>
-              <w:spacing w:after="60"/>
-            </w:pPr>
-            <w:r>
-              <w:rPr>
-                <w:rFonts w:ascii="Calibri" w:cs="Calibri" w:eastAsia="Calibri" w:hAnsi="Calibri"/>
-                <w:sz w:val="20"/>
-                <w:szCs w:val="20"/>
-              </w:rPr>
-              <w:t xml:space="preserve">Steeper lines and bigger days for experienced ski mountaineers.</w:t>
-            </w:r>
-          </w:p>
-          <w:p>
-            <w:pPr>
-              <w:spacing w:after="60"/>
-            </w:pPr>
-            <w:r>
-              <w:rPr>
-                <w:rFonts w:ascii="Calibri" w:cs="Calibri" w:eastAsia="Calibri" w:hAnsi="Calibri"/>
-                <w:sz w:val="20"/>
-                <w:szCs w:val="20"/>
-              </w:rPr>
-              <w:t xml:space="preserve">Experience: Previous ski mountaineering experience, or extensive touring experience with some ice axe and crampon mountaineering.</w:t>
-            </w:r>
-          </w:p>
-          <w:p>
-            <w:pPr>
-              <w:spacing w:after="0"/>
-            </w:pPr>
-            <w:r>
-              <w:rPr>
-                <w:rFonts w:ascii="Calibri" w:cs="Calibri" w:eastAsia="Calibri" w:hAnsi="Calibri"/>
-                <w:sz w:val="20"/>
-                <w:szCs w:val="20"/>
-              </w:rPr>
-              <w:t xml:space="preserve">Physical demand: Excellent physical condition. Train diligently.</w:t>
-            </w:r>
-          </w:p>
-        </w:tc>
-        <w:tc>
-          <w:tcPr>
-            <w:tcW w:type="dxa" w:w="2900"/>
-            <w:tcBorders>
-              <w:top w:val="single" w:color="DCE7EF" w:sz="4"/>
-              <w:left w:val="single" w:color="DCE7EF" w:sz="4"/>
-              <w:bottom w:val="single" w:color="DCE7EF" w:sz="4"/>
-              <w:right w:val="single" w:color="DCE7EF" w:sz="4"/>
-            </w:tcBorders>
-            <w:tcMar>
-              <w:top w:type="dxa" w:w="80"/>
-              <w:left w:type="dxa" w:w="110"/>
-              <w:bottom w:type="dxa" w:w="80"/>
-              <w:right w:type="dxa" w:w="110"/>
-            </w:tcMar>
-          </w:tcPr>
-          <w:p>
-            <w:pPr>
-              <w:spacing w:after="0"/>
-            </w:pPr>
-            <w:r>
-              <w:rPr>
-                <w:rFonts w:ascii="Calibri" w:cs="Calibri" w:eastAsia="Calibri" w:hAnsi="Calibri"/>
-                <w:color w:val="54697A"/>
-                <w:sz w:val="20"/>
-                <w:szCs w:val="20"/>
-              </w:rPr>
-              <w:t xml:space="preserve"/>
-            </w:r>
-          </w:p>
-        </w:tc>
-      </w:tr>
-      <w:tr>
-        <w:tc>
-          <w:tcPr>
-            <w:tcW w:type="dxa" w:w="1900"/>
-            <w:tcBorders>
-              <w:top w:val="single" w:color="DCE7EF" w:sz="4"/>
-              <w:left w:val="single" w:color="DCE7EF" w:sz="4"/>
-              <w:bottom w:val="single" w:color="DCE7EF" w:sz="4"/>
-              <w:right w:val="single" w:color="DCE7EF" w:sz="4"/>
-            </w:tcBorders>
-            <w:shd w:fill="E9F3FA" w:color="auto" w:val="clear"/>
-            <w:tcMar>
-              <w:top w:type="dxa" w:w="80"/>
-              <w:left w:type="dxa" w:w="110"/>
-              <w:bottom w:type="dxa" w:w="80"/>
-              <w:right w:type="dxa" w:w="110"/>
-            </w:tcMar>
-          </w:tcPr>
-          <w:p>
-            <w:pPr>
-              <w:spacing w:after="0"/>
-            </w:pPr>
-            <w:r>
-              <w:rPr>
-                <w:rFonts w:ascii="Calibri" w:cs="Calibri" w:eastAsia="Calibri" w:hAnsi="Calibri"/>
-                <w:b/>
-                <w:bCs/>
-                <w:sz w:val="19"/>
-                <w:szCs w:val="19"/>
-              </w:rPr>
-              <w:t xml:space="preserve">9. 5-Day Shasta–Lassen Cascade Challenge</w:t>
+              <w:t xml:space="preserve">8. 5-Day Shasta–Lassen Cascade Challenge</w:t>
             </w:r>
           </w:p>
         </w:tc>
@@ -26561,7 +26410,7 @@
           <w:sz w:val="18"/>
           <w:szCs w:val="18"/>
         </w:rPr>
-        <w:t xml:space="preserve">4 trip cards on this page, in order. Write KEEP, CUT or the 2027 price in the notes column.</w:t>
+        <w:t xml:space="preserve">3 trip cards on this page, in order. Write KEEP, CUT or the 2027 price in the notes column.</w:t>
       </w:r>
     </w:p>
     <w:tbl>
@@ -27032,141 +26881,6 @@
                 <w:szCs w:val="20"/>
               </w:rPr>
               <w:t xml:space="preserve">Hidden Valley and the north side glaciers. Sleep at a true mountaineering basecamp and learn the geology of the volcano, no summit push required.</w:t>
-            </w:r>
-          </w:p>
-          <w:p>
-            <w:pPr>
-              <w:spacing w:after="60"/>
-            </w:pPr>
-            <w:r>
-              <w:rPr>
-                <w:rFonts w:ascii="Calibri" w:cs="Calibri" w:eastAsia="Calibri" w:hAnsi="Calibri"/>
-                <w:sz w:val="20"/>
-                <w:szCs w:val="20"/>
-              </w:rPr>
-              <w:t xml:space="preserve">Experience: No previous experience is required.</w:t>
-            </w:r>
-          </w:p>
-          <w:p>
-            <w:pPr>
-              <w:spacing w:after="0"/>
-            </w:pPr>
-            <w:r>
-              <w:rPr>
-                <w:rFonts w:ascii="Calibri" w:cs="Calibri" w:eastAsia="Calibri" w:hAnsi="Calibri"/>
-                <w:sz w:val="20"/>
-                <w:szCs w:val="20"/>
-              </w:rPr>
-              <w:t xml:space="preserve">Physical demand: Expect high altitudes. Hikers should be in good physical condition.</w:t>
-            </w:r>
-          </w:p>
-        </w:tc>
-        <w:tc>
-          <w:tcPr>
-            <w:tcW w:type="dxa" w:w="2900"/>
-            <w:tcBorders>
-              <w:top w:val="single" w:color="DCE7EF" w:sz="4"/>
-              <w:left w:val="single" w:color="DCE7EF" w:sz="4"/>
-              <w:bottom w:val="single" w:color="DCE7EF" w:sz="4"/>
-              <w:right w:val="single" w:color="DCE7EF" w:sz="4"/>
-            </w:tcBorders>
-            <w:tcMar>
-              <w:top w:type="dxa" w:w="80"/>
-              <w:left w:type="dxa" w:w="110"/>
-              <w:bottom w:type="dxa" w:w="80"/>
-              <w:right w:type="dxa" w:w="110"/>
-            </w:tcMar>
-          </w:tcPr>
-          <w:p>
-            <w:pPr>
-              <w:spacing w:after="0"/>
-            </w:pPr>
-            <w:r>
-              <w:rPr>
-                <w:rFonts w:ascii="Calibri" w:cs="Calibri" w:eastAsia="Calibri" w:hAnsi="Calibri"/>
-                <w:color w:val="54697A"/>
-                <w:sz w:val="20"/>
-                <w:szCs w:val="20"/>
-              </w:rPr>
-              <w:t xml:space="preserve"/>
-            </w:r>
-          </w:p>
-        </w:tc>
-      </w:tr>
-      <w:tr>
-        <w:tc>
-          <w:tcPr>
-            <w:tcW w:type="dxa" w:w="1900"/>
-            <w:tcBorders>
-              <w:top w:val="single" w:color="DCE7EF" w:sz="4"/>
-              <w:left w:val="single" w:color="DCE7EF" w:sz="4"/>
-              <w:bottom w:val="single" w:color="DCE7EF" w:sz="4"/>
-              <w:right w:val="single" w:color="DCE7EF" w:sz="4"/>
-            </w:tcBorders>
-            <w:shd w:fill="E9F3FA" w:color="auto" w:val="clear"/>
-            <w:tcMar>
-              <w:top w:type="dxa" w:w="80"/>
-              <w:left w:type="dxa" w:w="110"/>
-              <w:bottom w:type="dxa" w:w="80"/>
-              <w:right w:type="dxa" w:w="110"/>
-            </w:tcMar>
-          </w:tcPr>
-          <w:p>
-            <w:pPr>
-              <w:spacing w:after="0"/>
-            </w:pPr>
-            <w:r>
-              <w:rPr>
-                <w:rFonts w:ascii="Calibri" w:cs="Calibri" w:eastAsia="Calibri" w:hAnsi="Calibri"/>
-                <w:b/>
-                <w:bCs/>
-                <w:sz w:val="19"/>
-                <w:szCs w:val="19"/>
-              </w:rPr>
-              <w:t xml:space="preserve">4. OAT x SMG Backpacking</w:t>
-            </w:r>
-          </w:p>
-        </w:tc>
-        <w:tc>
-          <w:tcPr>
-            <w:tcW w:type="dxa" w:w="4560"/>
-            <w:tcBorders>
-              <w:top w:val="single" w:color="DCE7EF" w:sz="4"/>
-              <w:left w:val="single" w:color="DCE7EF" w:sz="4"/>
-              <w:bottom w:val="single" w:color="DCE7EF" w:sz="4"/>
-              <w:right w:val="single" w:color="DCE7EF" w:sz="4"/>
-            </w:tcBorders>
-            <w:tcMar>
-              <w:top w:type="dxa" w:w="80"/>
-              <w:left w:type="dxa" w:w="110"/>
-              <w:bottom w:type="dxa" w:w="80"/>
-              <w:right w:type="dxa" w:w="110"/>
-            </w:tcMar>
-          </w:tcPr>
-          <w:p>
-            <w:pPr>
-              <w:spacing w:after="60"/>
-            </w:pPr>
-            <w:r>
-              <w:rPr>
-                <w:rFonts w:ascii="Calibri" w:cs="Calibri" w:eastAsia="Calibri" w:hAnsi="Calibri"/>
-                <w:sz w:val="20"/>
-                <w:szCs w:val="20"/>
-              </w:rPr>
-              <w:t xml:space="preserve">Length: 3 days  ·  Cost: $1,295 per person</w:t>
-            </w:r>
-          </w:p>
-          <w:p>
-            <w:pPr>
-              <w:spacing w:after="60"/>
-            </w:pPr>
-            <w:r>
-              <w:rPr>
-                <w:rFonts w:ascii="Calibri" w:cs="Calibri" w:eastAsia="Calibri" w:hAnsi="Calibri"/>
-                <w:sz w:val="20"/>
-                <w:szCs w:val="20"/>
-              </w:rPr>
-              <w:t xml:space="preserve">A PCT trip run with Outdoor Adventure Training.</w:t>
             </w:r>
           </w:p>
           <w:p>
@@ -31603,7 +31317,7 @@
           <w:sz w:val="20"/>
           <w:szCs w:val="20"/>
         </w:rPr>
-        <w:t xml:space="preserve">Three guide photos: John Michael McGinn, Lael Cashen and Rachel Foucher, plus a short bio for Rachel.</w:t>
+        <w:t xml:space="preserve">Guide photos for John Michael McGinn and Lael Cashen, and a decision on Rachel Foucher (keep, with photo and bio, or drop).</w:t>
       </w:r>
     </w:p>
     <w:p>
@@ -31639,7 +31353,7 @@
           <w:sz w:val="20"/>
           <w:szCs w:val="20"/>
         </w:rPr>
-        <w:t xml:space="preserve">Form routing: the email address (or CRM) that should receive contact-form and download leads.</w:t>
+        <w:t xml:space="preserve">A heads-up if the Expedition Style price moves to $1,695 in spring or summer.</w:t>
       </w:r>
     </w:p>
     <w:p>

</xml_diff>

<commit_message>
Swap in Chris's October 13 Drive photos
Eight new photos from the shared Drive folder, originals mirrored
and web-optimised copies in assets/images:

- Cosmic Wall shots replace the Rock Climbing placeholder: hero,
  homepage card, Cosmic Wall and Fun Climbing Day cards, photo strip
- glacier training on the Glacier II card
- clear creek on the Clear Creek climb card, hikeclearcreek in the
  Climb Shasta photo strip
- Porcupine Lake on the PCT Backpacking card
- dayhike as the Day Trips hero

Content sheet updated to match and the rock photo request removed.

Co-Authored-By: Claude Opus 5.5 <noreply@anthropic.com>
</commit_message>
<xml_diff>
--- a/Shasta Mountain Guides – Website Content Sheet (Round 3).docx
+++ b/Shasta Mountain Guides – Website Content Sheet (Round 3).docx
@@ -43,7 +43,7 @@
           <w:sz w:val="20"/>
           <w:szCs w:val="20"/>
         </w:rPr>
-        <w:t xml:space="preserve">Homepage + program pages · prepared by The Clay Media · revised October 14, 2026 with Chris’s Round 3 notes applied</w:t>
+        <w:t xml:space="preserve">Homepage + program pages · prepared by The Clay Media · revised October 21, 2026 with Chris’s Round 3 notes and October 13 photos applied</w:t>
       </w:r>
     </w:p>
     <w:p>
@@ -3016,7 +3016,7 @@
                 <w:sz w:val="20"/>
                 <w:szCs w:val="20"/>
               </w:rPr>
-              <w:t xml:space="preserve">Photo: “climbcasavalridge” — climbers on the rock and snow of Casaval Ridge</w:t>
+              <w:t xml:space="preserve">Photo: “mz.cosmic” — a climber on the granite of Cosmic Wall in Castle Crags</w:t>
             </w:r>
           </w:p>
         </w:tc>
@@ -3047,7 +3047,7 @@
                 <w:sz w:val="20"/>
                 <w:szCs w:val="20"/>
               </w:rPr>
-              <w:t xml:space="preserve">Done — moved to seventh. Still needs a true rock climbing photo; none in the Drive folder yet.</w:t>
+              <w:t xml:space="preserve">Done — moved to seventh, and now uses your Cosmic Wall photo. Is this Michael Zanger? We can caption it.</w:t>
             </w:r>
           </w:p>
         </w:tc>
@@ -13155,6 +13155,22 @@
           <w:sz w:val="18"/>
           <w:szCs w:val="18"/>
         </w:rPr>
+        <w:t xml:space="preserve">Added from the Drive folder on October 13 and now in use: cosmic (Rock Climbing hero), mz.cosmic (Rock Climbing card and Fun Climbing Day), cosmicgear (Cosmic Wall), glacier training (Glacier II), clear creek (Clear Creek climb), hikeclearcreek (Climb Shasta photo strip), Porcupine Lake (PCT Backpacking), dayhike (Day Trips hero).</w:t>
+      </w:r>
+    </w:p>
+    <w:p>
+      <w:pPr>
+        <w:spacing w:after="120"/>
+      </w:pPr>
+      <w:r>
+        <w:rPr>
+          <w:rFonts w:ascii="Calibri" w:cs="Calibri" w:eastAsia="Calibri" w:hAnsi="Calibri"/>
+          <w:i/>
+          <w:iCs/>
+          <w:color w:val="54697A"/>
+          <w:sz w:val="18"/>
+          <w:szCs w:val="18"/>
+        </w:rPr>
         <w:t xml:space="preserve">New in the Drive folder since Round 2, held for inner pages or swaps:</w:t>
       </w:r>
     </w:p>
@@ -28094,7 +28110,7 @@
                 <w:sz w:val="20"/>
                 <w:szCs w:val="20"/>
               </w:rPr>
-              <w:t xml:space="preserve">Climbers on the rock and snow of Casaval Ridge  —  Placeholder photo. Needs a real rock climbing shot.</w:t>
+              <w:t xml:space="preserve">A climber high on a granite spire in Castle Crags</w:t>
             </w:r>
           </w:p>
         </w:tc>
@@ -28125,7 +28141,7 @@
                 <w:sz w:val="20"/>
                 <w:szCs w:val="20"/>
               </w:rPr>
-              <w:t xml:space="preserve">Please send a real rock climbing photo.</w:t>
+              <w:t xml:space="preserve"/>
             </w:r>
           </w:p>
         </w:tc>
@@ -29877,7 +29893,7 @@
                 <w:sz w:val="20"/>
                 <w:szCs w:val="20"/>
               </w:rPr>
-              <w:t xml:space="preserve">A group raises their trekking poles at the trailhead with Mt. Shasta behind</w:t>
+              <w:t xml:space="preserve">A hiker on a trail facing the spires of Castle Crags</w:t>
             </w:r>
           </w:p>
         </w:tc>
@@ -31318,24 +31334,6 @@
           <w:szCs w:val="20"/>
         </w:rPr>
         <w:t xml:space="preserve">Guide photos for John Michael McGinn and Lael Cashen, and a decision on Rachel Foucher (keep, with photo and bio, or drop).</w:t>
-      </w:r>
-    </w:p>
-    <w:p>
-      <w:pPr>
-        <w:pStyle w:val="ListParagraph"/>
-        <w:numPr>
-          <w:ilvl w:val="0"/>
-          <w:numId w:val="2"/>
-        </w:numPr>
-        <w:spacing w:after="60"/>
-      </w:pPr>
-      <w:r>
-        <w:rPr>
-          <w:rFonts w:ascii="Calibri" w:cs="Calibri" w:eastAsia="Calibri" w:hAnsi="Calibri"/>
-          <w:sz w:val="20"/>
-          <w:szCs w:val="20"/>
-        </w:rPr>
-        <w:t xml:space="preserve">A real rock climbing photo for the Rock Climbing card.</w:t>
       </w:r>
     </w:p>
     <w:p>

</xml_diff>

<commit_message>
Drop the "what we still need" list from the client content sheet
Open items are raised in client meetings instead. Also fix the
homepage trip-card photo list to name the new Cosmic Wall photo.
The live Google Doc was updated in place to match, keeping Chris's
own notes with our replies beneath them.

Co-Authored-By: Claude Opus 5.5 <noreply@anthropic.com>
</commit_message>
<xml_diff>
--- a/Shasta Mountain Guides – Website Content Sheet (Round 3).docx
+++ b/Shasta Mountain Guides – Website Content Sheet (Round 3).docx
@@ -13044,7 +13044,7 @@
           <w:sz w:val="20"/>
           <w:szCs w:val="20"/>
         </w:rPr>
-        <w:t xml:space="preserve">Trip cards — shasta climb gulch shadow, Shastaski.gulch, guide helping, Climb.north2, skintrack, Northside basecamp, climbcasavalridge, Shasta trailhead</w:t>
+        <w:t xml:space="preserve">Trip cards — shasta climb gulch shadow, Shastaski.gulch, guide helping, Climb.north2, skintrack, Northside basecamp, mz.cosmic, Shasta trailhead</w:t>
       </w:r>
     </w:p>
     <w:p>
@@ -31265,136 +31265,6 @@
         </w:tc>
       </w:tr>
     </w:tbl>
-    <w:p>
-      <w:pPr>
-        <w:pStyle w:val="Heading1"/>
-        <w:spacing w:after="120" w:before="360"/>
-      </w:pPr>
-      <w:r>
-        <w:rPr>
-          <w:rFonts w:ascii="Calibri" w:cs="Calibri" w:eastAsia="Calibri" w:hAnsi="Calibri"/>
-          <w:b/>
-          <w:bCs/>
-          <w:color w:val="0B1C2B"/>
-          <w:sz w:val="30"/>
-          <w:szCs w:val="30"/>
-        </w:rPr>
-        <w:t xml:space="preserve">24.  What we still need from you</w:t>
-      </w:r>
-    </w:p>
-    <w:p>
-      <w:pPr>
-        <w:pStyle w:val="ListParagraph"/>
-        <w:numPr>
-          <w:ilvl w:val="0"/>
-          <w:numId w:val="2"/>
-        </w:numPr>
-        <w:spacing w:after="60"/>
-      </w:pPr>
-      <w:r>
-        <w:rPr>
-          <w:rFonts w:ascii="Calibri" w:cs="Calibri" w:eastAsia="Calibri" w:hAnsi="Calibri"/>
-          <w:sz w:val="20"/>
-          <w:szCs w:val="20"/>
-        </w:rPr>
-        <w:t xml:space="preserve">Flybook access: a login or the booking links so Book Now can open your reservation window.</w:t>
-      </w:r>
-    </w:p>
-    <w:p>
-      <w:pPr>
-        <w:pStyle w:val="ListParagraph"/>
-        <w:numPr>
-          <w:ilvl w:val="0"/>
-          <w:numId w:val="2"/>
-        </w:numPr>
-        <w:spacing w:after="60"/>
-      </w:pPr>
-      <w:r>
-        <w:rPr>
-          <w:rFonts w:ascii="Calibri" w:cs="Calibri" w:eastAsia="Calibri" w:hAnsi="Calibri"/>
-          <w:sz w:val="20"/>
-          <w:szCs w:val="20"/>
-        </w:rPr>
-        <w:t xml:space="preserve">Program changes: mark each trip in Part 2 as KEEP or CUT, and add 2027 prices and dates where they have changed.</w:t>
-      </w:r>
-    </w:p>
-    <w:p>
-      <w:pPr>
-        <w:pStyle w:val="ListParagraph"/>
-        <w:numPr>
-          <w:ilvl w:val="0"/>
-          <w:numId w:val="2"/>
-        </w:numPr>
-        <w:spacing w:after="60"/>
-      </w:pPr>
-      <w:r>
-        <w:rPr>
-          <w:rFonts w:ascii="Calibri" w:cs="Calibri" w:eastAsia="Calibri" w:hAnsi="Calibri"/>
-          <w:sz w:val="20"/>
-          <w:szCs w:val="20"/>
-        </w:rPr>
-        <w:t xml:space="preserve">Guide photos for John Michael McGinn and Lael Cashen, and a decision on Rachel Foucher (keep, with photo and bio, or drop).</w:t>
-      </w:r>
-    </w:p>
-    <w:p>
-      <w:pPr>
-        <w:pStyle w:val="ListParagraph"/>
-        <w:numPr>
-          <w:ilvl w:val="0"/>
-          <w:numId w:val="2"/>
-        </w:numPr>
-        <w:spacing w:after="60"/>
-      </w:pPr>
-      <w:r>
-        <w:rPr>
-          <w:rFonts w:ascii="Calibri" w:cs="Calibri" w:eastAsia="Calibri" w:hAnsi="Calibri"/>
-          <w:sz w:val="20"/>
-          <w:szCs w:val="20"/>
-        </w:rPr>
-        <w:t xml:space="preserve">A heads-up if the Expedition Style price moves to $1,695 in spring or summer.</w:t>
-      </w:r>
-    </w:p>
-    <w:p>
-      <w:pPr>
-        <w:pStyle w:val="ListParagraph"/>
-        <w:numPr>
-          <w:ilvl w:val="0"/>
-          <w:numId w:val="2"/>
-        </w:numPr>
-        <w:spacing w:after="60"/>
-      </w:pPr>
-      <w:r>
-        <w:rPr>
-          <w:rFonts w:ascii="Calibri" w:cs="Calibri" w:eastAsia="Calibri" w:hAnsi="Calibri"/>
-          <w:sz w:val="20"/>
-          <w:szCs w:val="20"/>
-        </w:rPr>
-        <w:t xml:space="preserve">Route quiz check: a quick read of the six quiz outcomes for accuracy on routes and seasons.</w:t>
-      </w:r>
-    </w:p>
-    <w:p>
-      <w:pPr>
-        <w:pStyle w:val="ListParagraph"/>
-        <w:numPr>
-          <w:ilvl w:val="0"/>
-          <w:numId w:val="2"/>
-        </w:numPr>
-        <w:spacing w:after="60"/>
-      </w:pPr>
-      <w:r>
-        <w:rPr>
-          <w:rFonts w:ascii="Calibri" w:cs="Calibri" w:eastAsia="Calibri" w:hAnsi="Calibri"/>
-          <w:sz w:val="20"/>
-          <w:szCs w:val="20"/>
-        </w:rPr>
-        <w:t xml:space="preserve">GoDaddy access for team@theclaymedia.com so we can prepare hosting.</w:t>
-      </w:r>
-    </w:p>
-    <w:p>
-      <w:pPr>
-        <w:spacing w:after="60"/>
-      </w:pPr>
-    </w:p>
     <w:p>
       <w:pPr>
         <w:spacing w:after="100"/>

</xml_diff>

<commit_message>
Remove the closing send-it-back line from the content sheet
It belonged to the open-items section that was dropped.

Co-Authored-By: Claude Opus 5.5 <noreply@anthropic.com>
</commit_message>
<xml_diff>
--- a/Shasta Mountain Guides – Website Content Sheet (Round 3).docx
+++ b/Shasta Mountain Guides – Website Content Sheet (Round 3).docx
@@ -31265,20 +31265,6 @@
         </w:tc>
       </w:tr>
     </w:tbl>
-    <w:p>
-      <w:pPr>
-        <w:spacing w:after="100"/>
-      </w:pPr>
-      <w:r>
-        <w:rPr>
-          <w:rFonts w:ascii="Calibri" w:cs="Calibri" w:eastAsia="Calibri" w:hAnsi="Calibri"/>
-          <w:color w:val="54697A"/>
-          <w:sz w:val="20"/>
-          <w:szCs w:val="20"/>
-        </w:rPr>
-        <w:t xml:space="preserve">Once you have been through this, send it back with your notes and we will fold everything into the build.</w:t>
-      </w:r>
-    </w:p>
     <w:sectPr>
       <w:pgSz w:w="12240" w:h="15840" w:orient="portrait"/>
       <w:pgMar w:top="1440" w:right="1440" w:bottom="1440" w:left="1440" w:header="708" w:footer="708" w:gutter="0"/>

</xml_diff>

<commit_message>
Apply Chris's photo notes using photos already on hand
- Mountaineering Courses: homepage card now shows the glacier rope
  training photo and the page hero the roped Hotlum ridge climb,
  as stopgaps until Chris uploads his replacements
- Day Trips homepage card matches its page with the Castle Crags hike
- Single-Day Ski Push card shows a skier below the Red Banks instead
  of climbers on foot

The Ski Shasta card note is ambiguous and left for Chris to clarify.
Content sheet generator updated to match the live Google Doc.

Co-Authored-By: Claude Opus 5.5 <noreply@anthropic.com>
</commit_message>
<xml_diff>
--- a/Shasta Mountain Guides – Website Content Sheet (Round 3).docx
+++ b/Shasta Mountain Guides – Website Content Sheet (Round 3).docx
@@ -2632,7 +2632,7 @@
                 <w:sz w:val="20"/>
                 <w:szCs w:val="20"/>
               </w:rPr>
-              <w:t xml:space="preserve">Photo: “guide helping” — guide fitting a climber’s crampons at camp</w:t>
+              <w:t xml:space="preserve">Photo: “glacier training” — a guide teaching rope and crevasse rescue skills on the glacier</w:t>
             </w:r>
           </w:p>
         </w:tc>
@@ -2663,7 +2663,7 @@
                 <w:sz w:val="20"/>
                 <w:szCs w:val="20"/>
               </w:rPr>
-              <w:t xml:space="preserve">Done — moved to third.</w:t>
+              <w:t xml:space="preserve">Done for now — shows the glacier rope training photo until your new content arrives.</w:t>
             </w:r>
           </w:p>
         </w:tc>
@@ -3112,7 +3112,7 @@
                 <w:sz w:val="20"/>
                 <w:szCs w:val="20"/>
               </w:rPr>
-              <w:t xml:space="preserve">Photo: “Shasta trailhead” — group raising poles at the trailhead</w:t>
+              <w:t xml:space="preserve">Photo: “dayhike” — a hiker facing the spires of Castle Crags</w:t>
             </w:r>
           </w:p>
         </w:tc>
@@ -3143,7 +3143,7 @@
                 <w:sz w:val="20"/>
                 <w:szCs w:val="20"/>
               </w:rPr>
-              <w:t xml:space="preserve"/>
+              <w:t xml:space="preserve">Done — now matches the Day Trips page.</w:t>
             </w:r>
           </w:p>
         </w:tc>
@@ -13044,7 +13044,7 @@
           <w:sz w:val="20"/>
           <w:szCs w:val="20"/>
         </w:rPr>
-        <w:t xml:space="preserve">Trip cards — shasta climb gulch shadow, Shastaski.gulch, guide helping, Climb.north2, skintrack, Northside basecamp, mz.cosmic, Shasta trailhead</w:t>
+        <w:t xml:space="preserve">Trip cards — shasta climb gulch shadow, Shastaski.gulch, glacier training, Climb.north2, skintrack, Northside basecamp, mz.cosmic, dayhike</w:t>
       </w:r>
     </w:p>
     <w:p>
@@ -13155,7 +13155,7 @@
           <w:sz w:val="18"/>
           <w:szCs w:val="18"/>
         </w:rPr>
-        <w:t xml:space="preserve">Added from the Drive folder on October 13 and now in use: cosmic (Rock Climbing hero), mz.cosmic (Rock Climbing card and Fun Climbing Day), cosmicgear (Cosmic Wall), glacier training (Glacier II), clear creek (Clear Creek climb), hikeclearcreek (Climb Shasta photo strip), Porcupine Lake (PCT Backpacking), dayhike (Day Trips hero).</w:t>
+        <w:t xml:space="preserve">Added from the Drive folder on October 13 and now in use: cosmic (Rock Climbing hero), mz.cosmic (Rock Climbing card and Fun Climbing Day), cosmicgear (Cosmic Wall), glacier training (Glacier II and the Mountaineering card), clear creek (Clear Creek climb), hikeclearcreek (Climb Shasta photo strip), Porcupine Lake (PCT Backpacking), dayhike (Day Trips hero and card).</w:t>
       </w:r>
     </w:p>
     <w:p>
@@ -19453,7 +19453,7 @@
                 <w:sz w:val="20"/>
                 <w:szCs w:val="20"/>
               </w:rPr>
-              <w:t xml:space="preserve">A Shasta Mountain Guides instructor helps a climber fit crampons at camp</w:t>
+              <w:t xml:space="preserve">A roped team climbs a steep snow ridge high on Mt. Shasta</w:t>
             </w:r>
           </w:p>
         </w:tc>

</xml_diff>